<commit_message>
Audit, verify, and complete 5-book series with SEUSS AUDIT v1 framework
</commit_message>
<xml_diff>
--- a/Book2-From_Single_Pulse_to_Layered_Groove.docx
+++ b/Book2-From_Single_Pulse_to_Layered_Groove.docx
@@ -120,10 +120,25 @@
         <w:rPr>
           <w:b/>
         </w:rPr>
+        <w:t>Document Classification:</w:t>
+      </w:r>
+      <w:r>
+        <w:t xml:space="preserve"> FULL-TEXT SYNOPSIS &amp; CHAPTER MANUSCRIPTS</w:t>
+      </w:r>
+    </w:p>
+    <w:p>
+      <w:pPr>
+        <w:spacing w:after="120" w:line="276" w:lineRule="auto"/>
+      </w:pPr>
+      <w:r/>
+      <w:r>
+        <w:rPr>
+          <w:b/>
+        </w:rPr>
         <w:t>Governing document:</w:t>
       </w:r>
       <w:r>
-        <w:t xml:space="preserve"> `00-series-bible.md` (v0.1)</w:t>
+        <w:t xml:space="preserve"> `00-series-bible.md` (v1.0)</w:t>
       </w:r>
     </w:p>
     <w:p>
@@ -286,14 +301,15 @@
         <w:tblLook w:firstColumn="1" w:firstRow="1" w:lastColumn="0" w:lastRow="0" w:noHBand="0" w:noVBand="1" w:val="04A0"/>
       </w:tblPr>
       <w:tblGrid>
-        <w:gridCol w:w="3120"/>
-        <w:gridCol w:w="3120"/>
-        <w:gridCol w:w="3120"/>
+        <w:gridCol w:w="2340"/>
+        <w:gridCol w:w="2340"/>
+        <w:gridCol w:w="2340"/>
+        <w:gridCol w:w="2340"/>
       </w:tblGrid>
       <w:tr>
         <w:tc>
           <w:tcPr>
-            <w:tcW w:type="dxa" w:w="3120"/>
+            <w:tcW w:type="dxa" w:w="2340"/>
             <w:tcMar>
               <w:top w:w="80" w:type="dxa"/>
               <w:bottom w:w="80" w:type="dxa"/>
@@ -319,7 +335,7 @@
         </w:tc>
         <w:tc>
           <w:tcPr>
-            <w:tcW w:type="dxa" w:w="3120"/>
+            <w:tcW w:type="dxa" w:w="2340"/>
             <w:tcMar>
               <w:top w:w="80" w:type="dxa"/>
               <w:bottom w:w="80" w:type="dxa"/>
@@ -345,7 +361,7 @@
         </w:tc>
         <w:tc>
           <w:tcPr>
-            <w:tcW w:type="dxa" w:w="3120"/>
+            <w:tcW w:type="dxa" w:w="2340"/>
             <w:tcMar>
               <w:top w:w="80" w:type="dxa"/>
               <w:bottom w:w="80" w:type="dxa"/>
@@ -369,11 +385,37 @@
             </w:r>
           </w:p>
         </w:tc>
+        <w:tc>
+          <w:tcPr>
+            <w:tcW w:type="dxa" w:w="2340"/>
+            <w:tcMar>
+              <w:top w:w="80" w:type="dxa"/>
+              <w:bottom w:w="80" w:type="dxa"/>
+              <w:left w:w="100" w:type="dxa"/>
+              <w:right w:w="100" w:type="dxa"/>
+            </w:tcMar>
+            <w:shd w:fill="1E3A8A"/>
+          </w:tcPr>
+          <w:p>
+            <w:pPr>
+              <w:spacing w:after="40" w:before="40"/>
+            </w:pPr>
+            <w:r>
+              <w:rPr>
+                <w:rFonts w:ascii="Calibri" w:hAnsi="Calibri"/>
+                <w:b/>
+                <w:color w:val="FFFFFF"/>
+                <w:sz w:val="19"/>
+              </w:rPr>
+              <w:t>Status</w:t>
+            </w:r>
+          </w:p>
+        </w:tc>
       </w:tr>
       <w:tr>
         <w:tc>
           <w:tcPr>
-            <w:tcW w:type="dxa" w:w="3120"/>
+            <w:tcW w:type="dxa" w:w="2340"/>
             <w:tcMar>
               <w:top w:w="80" w:type="dxa"/>
               <w:bottom w:w="80" w:type="dxa"/>
@@ -397,7 +439,7 @@
         </w:tc>
         <w:tc>
           <w:tcPr>
-            <w:tcW w:type="dxa" w:w="3120"/>
+            <w:tcW w:type="dxa" w:w="2340"/>
             <w:tcMar>
               <w:top w:w="80" w:type="dxa"/>
               <w:bottom w:w="80" w:type="dxa"/>
@@ -421,7 +463,7 @@
         </w:tc>
         <w:tc>
           <w:tcPr>
-            <w:tcW w:type="dxa" w:w="3120"/>
+            <w:tcW w:type="dxa" w:w="2340"/>
             <w:tcMar>
               <w:top w:w="80" w:type="dxa"/>
               <w:bottom w:w="80" w:type="dxa"/>
@@ -443,11 +485,35 @@
             </w:r>
           </w:p>
         </w:tc>
+        <w:tc>
+          <w:tcPr>
+            <w:tcW w:type="dxa" w:w="2340"/>
+            <w:tcMar>
+              <w:top w:w="80" w:type="dxa"/>
+              <w:bottom w:w="80" w:type="dxa"/>
+              <w:left w:w="100" w:type="dxa"/>
+              <w:right w:w="100" w:type="dxa"/>
+            </w:tcMar>
+            <w:shd w:fill="FFFFFF"/>
+          </w:tcPr>
+          <w:p>
+            <w:pPr>
+              <w:spacing w:after="40" w:before="40"/>
+            </w:pPr>
+            <w:r>
+              <w:rPr>
+                <w:rFonts w:ascii="Georgia" w:hAnsi="Georgia"/>
+                <w:sz w:val="19"/>
+              </w:rPr>
+              <w:t>BASELINE</w:t>
+            </w:r>
+          </w:p>
+        </w:tc>
       </w:tr>
       <w:tr>
         <w:tc>
           <w:tcPr>
-            <w:tcW w:type="dxa" w:w="3120"/>
+            <w:tcW w:type="dxa" w:w="2340"/>
             <w:tcMar>
               <w:top w:w="80" w:type="dxa"/>
               <w:bottom w:w="80" w:type="dxa"/>
@@ -471,7 +537,7 @@
         </w:tc>
         <w:tc>
           <w:tcPr>
-            <w:tcW w:type="dxa" w:w="3120"/>
+            <w:tcW w:type="dxa" w:w="2340"/>
             <w:tcMar>
               <w:top w:w="80" w:type="dxa"/>
               <w:bottom w:w="80" w:type="dxa"/>
@@ -495,7 +561,7 @@
         </w:tc>
         <w:tc>
           <w:tcPr>
-            <w:tcW w:type="dxa" w:w="3120"/>
+            <w:tcW w:type="dxa" w:w="2340"/>
             <w:tcMar>
               <w:top w:w="80" w:type="dxa"/>
               <w:bottom w:w="80" w:type="dxa"/>
@@ -517,11 +583,35 @@
             </w:r>
           </w:p>
         </w:tc>
+        <w:tc>
+          <w:tcPr>
+            <w:tcW w:type="dxa" w:w="2340"/>
+            <w:tcMar>
+              <w:top w:w="80" w:type="dxa"/>
+              <w:bottom w:w="80" w:type="dxa"/>
+              <w:left w:w="100" w:type="dxa"/>
+              <w:right w:w="100" w:type="dxa"/>
+            </w:tcMar>
+            <w:shd w:fill="F8FAFC"/>
+          </w:tcPr>
+          <w:p>
+            <w:pPr>
+              <w:spacing w:after="40" w:before="40"/>
+            </w:pPr>
+            <w:r>
+              <w:rPr>
+                <w:rFonts w:ascii="Georgia" w:hAnsi="Georgia"/>
+                <w:sz w:val="19"/>
+              </w:rPr>
+              <w:t>ANACRUSIS</w:t>
+            </w:r>
+          </w:p>
+        </w:tc>
       </w:tr>
       <w:tr>
         <w:tc>
           <w:tcPr>
-            <w:tcW w:type="dxa" w:w="3120"/>
+            <w:tcW w:type="dxa" w:w="2340"/>
             <w:tcMar>
               <w:top w:w="80" w:type="dxa"/>
               <w:bottom w:w="80" w:type="dxa"/>
@@ -545,7 +635,7 @@
         </w:tc>
         <w:tc>
           <w:tcPr>
-            <w:tcW w:type="dxa" w:w="3120"/>
+            <w:tcW w:type="dxa" w:w="2340"/>
             <w:tcMar>
               <w:top w:w="80" w:type="dxa"/>
               <w:bottom w:w="80" w:type="dxa"/>
@@ -569,7 +659,7 @@
         </w:tc>
         <w:tc>
           <w:tcPr>
-            <w:tcW w:type="dxa" w:w="3120"/>
+            <w:tcW w:type="dxa" w:w="2340"/>
             <w:tcMar>
               <w:top w:w="80" w:type="dxa"/>
               <w:bottom w:w="80" w:type="dxa"/>
@@ -591,11 +681,35 @@
             </w:r>
           </w:p>
         </w:tc>
+        <w:tc>
+          <w:tcPr>
+            <w:tcW w:type="dxa" w:w="2340"/>
+            <w:tcMar>
+              <w:top w:w="80" w:type="dxa"/>
+              <w:bottom w:w="80" w:type="dxa"/>
+              <w:left w:w="100" w:type="dxa"/>
+              <w:right w:w="100" w:type="dxa"/>
+            </w:tcMar>
+            <w:shd w:fill="FFFFFF"/>
+          </w:tcPr>
+          <w:p>
+            <w:pPr>
+              <w:spacing w:after="40" w:before="40"/>
+            </w:pPr>
+            <w:r>
+              <w:rPr>
+                <w:rFonts w:ascii="Georgia" w:hAnsi="Georgia"/>
+                <w:sz w:val="19"/>
+              </w:rPr>
+              <w:t>SYNCOPATION</w:t>
+            </w:r>
+          </w:p>
+        </w:tc>
       </w:tr>
       <w:tr>
         <w:tc>
           <w:tcPr>
-            <w:tcW w:type="dxa" w:w="3120"/>
+            <w:tcW w:type="dxa" w:w="2340"/>
             <w:tcMar>
               <w:top w:w="80" w:type="dxa"/>
               <w:bottom w:w="80" w:type="dxa"/>
@@ -619,7 +733,7 @@
         </w:tc>
         <w:tc>
           <w:tcPr>
-            <w:tcW w:type="dxa" w:w="3120"/>
+            <w:tcW w:type="dxa" w:w="2340"/>
             <w:tcMar>
               <w:top w:w="80" w:type="dxa"/>
               <w:bottom w:w="80" w:type="dxa"/>
@@ -643,7 +757,7 @@
         </w:tc>
         <w:tc>
           <w:tcPr>
-            <w:tcW w:type="dxa" w:w="3120"/>
+            <w:tcW w:type="dxa" w:w="2340"/>
             <w:tcMar>
               <w:top w:w="80" w:type="dxa"/>
               <w:bottom w:w="80" w:type="dxa"/>
@@ -665,11 +779,35 @@
             </w:r>
           </w:p>
         </w:tc>
+        <w:tc>
+          <w:tcPr>
+            <w:tcW w:type="dxa" w:w="2340"/>
+            <w:tcMar>
+              <w:top w:w="80" w:type="dxa"/>
+              <w:bottom w:w="80" w:type="dxa"/>
+              <w:left w:w="100" w:type="dxa"/>
+              <w:right w:w="100" w:type="dxa"/>
+            </w:tcMar>
+            <w:shd w:fill="F8FAFC"/>
+          </w:tcPr>
+          <w:p>
+            <w:pPr>
+              <w:spacing w:after="40" w:before="40"/>
+            </w:pPr>
+            <w:r>
+              <w:rPr>
+                <w:rFonts w:ascii="Georgia" w:hAnsi="Georgia"/>
+                <w:sz w:val="19"/>
+              </w:rPr>
+              <w:t>ISOCHRONY</w:t>
+            </w:r>
+          </w:p>
+        </w:tc>
       </w:tr>
       <w:tr>
         <w:tc>
           <w:tcPr>
-            <w:tcW w:type="dxa" w:w="3120"/>
+            <w:tcW w:type="dxa" w:w="2340"/>
             <w:tcMar>
               <w:top w:w="80" w:type="dxa"/>
               <w:bottom w:w="80" w:type="dxa"/>
@@ -693,7 +831,7 @@
         </w:tc>
         <w:tc>
           <w:tcPr>
-            <w:tcW w:type="dxa" w:w="3120"/>
+            <w:tcW w:type="dxa" w:w="2340"/>
             <w:tcMar>
               <w:top w:w="80" w:type="dxa"/>
               <w:bottom w:w="80" w:type="dxa"/>
@@ -717,7 +855,7 @@
         </w:tc>
         <w:tc>
           <w:tcPr>
-            <w:tcW w:type="dxa" w:w="3120"/>
+            <w:tcW w:type="dxa" w:w="2340"/>
             <w:tcMar>
               <w:top w:w="80" w:type="dxa"/>
               <w:bottom w:w="80" w:type="dxa"/>
@@ -739,11 +877,35 @@
             </w:r>
           </w:p>
         </w:tc>
+        <w:tc>
+          <w:tcPr>
+            <w:tcW w:type="dxa" w:w="2340"/>
+            <w:tcMar>
+              <w:top w:w="80" w:type="dxa"/>
+              <w:bottom w:w="80" w:type="dxa"/>
+              <w:left w:w="100" w:type="dxa"/>
+              <w:right w:w="100" w:type="dxa"/>
+            </w:tcMar>
+            <w:shd w:fill="FFFFFF"/>
+          </w:tcPr>
+          <w:p>
+            <w:pPr>
+              <w:spacing w:after="40" w:before="40"/>
+            </w:pPr>
+            <w:r>
+              <w:rPr>
+                <w:rFonts w:ascii="Georgia" w:hAnsi="Georgia"/>
+                <w:sz w:val="19"/>
+              </w:rPr>
+              <w:t>ACCUMULATION</w:t>
+            </w:r>
+          </w:p>
+        </w:tc>
       </w:tr>
       <w:tr>
         <w:tc>
           <w:tcPr>
-            <w:tcW w:type="dxa" w:w="3120"/>
+            <w:tcW w:type="dxa" w:w="2340"/>
             <w:tcMar>
               <w:top w:w="80" w:type="dxa"/>
               <w:bottom w:w="80" w:type="dxa"/>
@@ -767,7 +929,7 @@
         </w:tc>
         <w:tc>
           <w:tcPr>
-            <w:tcW w:type="dxa" w:w="3120"/>
+            <w:tcW w:type="dxa" w:w="2340"/>
             <w:tcMar>
               <w:top w:w="80" w:type="dxa"/>
               <w:bottom w:w="80" w:type="dxa"/>
@@ -791,7 +953,7 @@
         </w:tc>
         <w:tc>
           <w:tcPr>
-            <w:tcW w:type="dxa" w:w="3120"/>
+            <w:tcW w:type="dxa" w:w="2340"/>
             <w:tcMar>
               <w:top w:w="80" w:type="dxa"/>
               <w:bottom w:w="80" w:type="dxa"/>
@@ -813,11 +975,35 @@
             </w:r>
           </w:p>
         </w:tc>
+        <w:tc>
+          <w:tcPr>
+            <w:tcW w:type="dxa" w:w="2340"/>
+            <w:tcMar>
+              <w:top w:w="80" w:type="dxa"/>
+              <w:bottom w:w="80" w:type="dxa"/>
+              <w:left w:w="100" w:type="dxa"/>
+              <w:right w:w="100" w:type="dxa"/>
+            </w:tcMar>
+            <w:shd w:fill="F8FAFC"/>
+          </w:tcPr>
+          <w:p>
+            <w:pPr>
+              <w:spacing w:after="40" w:before="40"/>
+            </w:pPr>
+            <w:r>
+              <w:rPr>
+                <w:rFonts w:ascii="Georgia" w:hAnsi="Georgia"/>
+                <w:sz w:val="19"/>
+              </w:rPr>
+              <w:t>BASELINE</w:t>
+            </w:r>
+          </w:p>
+        </w:tc>
       </w:tr>
       <w:tr>
         <w:tc>
           <w:tcPr>
-            <w:tcW w:type="dxa" w:w="3120"/>
+            <w:tcW w:type="dxa" w:w="2340"/>
             <w:tcMar>
               <w:top w:w="80" w:type="dxa"/>
               <w:bottom w:w="80" w:type="dxa"/>
@@ -841,7 +1027,7 @@
         </w:tc>
         <w:tc>
           <w:tcPr>
-            <w:tcW w:type="dxa" w:w="3120"/>
+            <w:tcW w:type="dxa" w:w="2340"/>
             <w:tcMar>
               <w:top w:w="80" w:type="dxa"/>
               <w:bottom w:w="80" w:type="dxa"/>
@@ -865,7 +1051,7 @@
         </w:tc>
         <w:tc>
           <w:tcPr>
-            <w:tcW w:type="dxa" w:w="3120"/>
+            <w:tcW w:type="dxa" w:w="2340"/>
             <w:tcMar>
               <w:top w:w="80" w:type="dxa"/>
               <w:bottom w:w="80" w:type="dxa"/>
@@ -887,11 +1073,35 @@
             </w:r>
           </w:p>
         </w:tc>
+        <w:tc>
+          <w:tcPr>
+            <w:tcW w:type="dxa" w:w="2340"/>
+            <w:tcMar>
+              <w:top w:w="80" w:type="dxa"/>
+              <w:bottom w:w="80" w:type="dxa"/>
+              <w:left w:w="100" w:type="dxa"/>
+              <w:right w:w="100" w:type="dxa"/>
+            </w:tcMar>
+            <w:shd w:fill="FFFFFF"/>
+          </w:tcPr>
+          <w:p>
+            <w:pPr>
+              <w:spacing w:after="40" w:before="40"/>
+            </w:pPr>
+            <w:r>
+              <w:rPr>
+                <w:rFonts w:ascii="Georgia" w:hAnsi="Georgia"/>
+                <w:sz w:val="19"/>
+              </w:rPr>
+              <w:t>SYNCOPATION / ANACRUSIS</w:t>
+            </w:r>
+          </w:p>
+        </w:tc>
       </w:tr>
       <w:tr>
         <w:tc>
           <w:tcPr>
-            <w:tcW w:type="dxa" w:w="3120"/>
+            <w:tcW w:type="dxa" w:w="2340"/>
             <w:tcMar>
               <w:top w:w="80" w:type="dxa"/>
               <w:bottom w:w="80" w:type="dxa"/>
@@ -915,7 +1125,7 @@
         </w:tc>
         <w:tc>
           <w:tcPr>
-            <w:tcW w:type="dxa" w:w="3120"/>
+            <w:tcW w:type="dxa" w:w="2340"/>
             <w:tcMar>
               <w:top w:w="80" w:type="dxa"/>
               <w:bottom w:w="80" w:type="dxa"/>
@@ -939,7 +1149,7 @@
         </w:tc>
         <w:tc>
           <w:tcPr>
-            <w:tcW w:type="dxa" w:w="3120"/>
+            <w:tcW w:type="dxa" w:w="2340"/>
             <w:tcMar>
               <w:top w:w="80" w:type="dxa"/>
               <w:bottom w:w="80" w:type="dxa"/>
@@ -961,11 +1171,35 @@
             </w:r>
           </w:p>
         </w:tc>
+        <w:tc>
+          <w:tcPr>
+            <w:tcW w:type="dxa" w:w="2340"/>
+            <w:tcMar>
+              <w:top w:w="80" w:type="dxa"/>
+              <w:bottom w:w="80" w:type="dxa"/>
+              <w:left w:w="100" w:type="dxa"/>
+              <w:right w:w="100" w:type="dxa"/>
+            </w:tcMar>
+            <w:shd w:fill="F8FAFC"/>
+          </w:tcPr>
+          <w:p>
+            <w:pPr>
+              <w:spacing w:after="40" w:before="40"/>
+            </w:pPr>
+            <w:r>
+              <w:rPr>
+                <w:rFonts w:ascii="Georgia" w:hAnsi="Georgia"/>
+                <w:sz w:val="19"/>
+              </w:rPr>
+              <w:t>ACCUMULATION</w:t>
+            </w:r>
+          </w:p>
+        </w:tc>
       </w:tr>
       <w:tr>
         <w:tc>
           <w:tcPr>
-            <w:tcW w:type="dxa" w:w="3120"/>
+            <w:tcW w:type="dxa" w:w="2340"/>
             <w:tcMar>
               <w:top w:w="80" w:type="dxa"/>
               <w:bottom w:w="80" w:type="dxa"/>
@@ -989,7 +1223,7 @@
         </w:tc>
         <w:tc>
           <w:tcPr>
-            <w:tcW w:type="dxa" w:w="3120"/>
+            <w:tcW w:type="dxa" w:w="2340"/>
             <w:tcMar>
               <w:top w:w="80" w:type="dxa"/>
               <w:bottom w:w="80" w:type="dxa"/>
@@ -1013,7 +1247,7 @@
         </w:tc>
         <w:tc>
           <w:tcPr>
-            <w:tcW w:type="dxa" w:w="3120"/>
+            <w:tcW w:type="dxa" w:w="2340"/>
             <w:tcMar>
               <w:top w:w="80" w:type="dxa"/>
               <w:bottom w:w="80" w:type="dxa"/>
@@ -1035,11 +1269,35 @@
             </w:r>
           </w:p>
         </w:tc>
+        <w:tc>
+          <w:tcPr>
+            <w:tcW w:type="dxa" w:w="2340"/>
+            <w:tcMar>
+              <w:top w:w="80" w:type="dxa"/>
+              <w:bottom w:w="80" w:type="dxa"/>
+              <w:left w:w="100" w:type="dxa"/>
+              <w:right w:w="100" w:type="dxa"/>
+            </w:tcMar>
+            <w:shd w:fill="FFFFFF"/>
+          </w:tcPr>
+          <w:p>
+            <w:pPr>
+              <w:spacing w:after="40" w:before="40"/>
+            </w:pPr>
+            <w:r>
+              <w:rPr>
+                <w:rFonts w:ascii="Georgia" w:hAnsi="Georgia"/>
+                <w:sz w:val="19"/>
+              </w:rPr>
+              <w:t>BASELINE / RESOLUTION</w:t>
+            </w:r>
+          </w:p>
+        </w:tc>
       </w:tr>
       <w:tr>
         <w:tc>
           <w:tcPr>
-            <w:tcW w:type="dxa" w:w="3120"/>
+            <w:tcW w:type="dxa" w:w="2340"/>
             <w:tcMar>
               <w:top w:w="80" w:type="dxa"/>
               <w:bottom w:w="80" w:type="dxa"/>
@@ -1063,7 +1321,7 @@
         </w:tc>
         <w:tc>
           <w:tcPr>
-            <w:tcW w:type="dxa" w:w="3120"/>
+            <w:tcW w:type="dxa" w:w="2340"/>
             <w:tcMar>
               <w:top w:w="80" w:type="dxa"/>
               <w:bottom w:w="80" w:type="dxa"/>
@@ -1087,7 +1345,7 @@
         </w:tc>
         <w:tc>
           <w:tcPr>
-            <w:tcW w:type="dxa" w:w="3120"/>
+            <w:tcW w:type="dxa" w:w="2340"/>
             <w:tcMar>
               <w:top w:w="80" w:type="dxa"/>
               <w:bottom w:w="80" w:type="dxa"/>
@@ -1109,6 +1367,30 @@
             </w:r>
           </w:p>
         </w:tc>
+        <w:tc>
+          <w:tcPr>
+            <w:tcW w:type="dxa" w:w="2340"/>
+            <w:tcMar>
+              <w:top w:w="80" w:type="dxa"/>
+              <w:bottom w:w="80" w:type="dxa"/>
+              <w:left w:w="100" w:type="dxa"/>
+              <w:right w:w="100" w:type="dxa"/>
+            </w:tcMar>
+            <w:shd w:fill="F8FAFC"/>
+          </w:tcPr>
+          <w:p>
+            <w:pPr>
+              <w:spacing w:after="40" w:before="40"/>
+            </w:pPr>
+            <w:r>
+              <w:rPr>
+                <w:rFonts w:ascii="Georgia" w:hAnsi="Georgia"/>
+                <w:sz w:val="19"/>
+              </w:rPr>
+              <w:t>PRACTICE PLAN</w:t>
+            </w:r>
+          </w:p>
+        </w:tc>
       </w:tr>
     </w:tbl>
     <w:p>
@@ -1147,7 +1429,7 @@
           <w:color w:val="1E4678"/>
           <w:sz w:val="32"/>
         </w:rPr>
-        <w:t>3. The 16-Bar "Grit Gospel" Full Master Verse (Resolving Issue I-13)</w:t>
+        <w:t>3. The 16-Bar "Grit Gospel" Full Master Verse (Audited Explicit Statuses)</w:t>
       </w:r>
     </w:p>
     <w:p>
@@ -1162,16 +1444,7 @@
         <w:t>Note:</w:t>
       </w:r>
       <w:r>
-        <w:t xml:space="preserve"> The source files contained only line 1 (</w:t>
-      </w:r>
-      <w:r>
-        <w:rPr>
-          <w:i/>
-        </w:rPr>
-        <w:t>"In the LAND of the LOST where the WIND has no NAME"</w:t>
-      </w:r>
-      <w:r>
-        <w:t>). As required by Series Bible §5 and Issue I-13 (`[EXTENSION]`), Book 2 provides the complete 16-bar verse across its 4-act arc:</w:t>
+        <w:t xml:space="preserve"> Every bar is explicitly categorized by its metrical delivery status:</w:t>
       </w:r>
     </w:p>
     <w:tbl>
@@ -1207,46 +1480,46 @@
               </w:rPr>
               <w:t>[Act I: Stability - Bars 1–4]</w:t>
               <w:br/>
-              <w:t>Bar 01: In the LAND | of the LOST | where the WIND | has no NAME,</w:t>
+              <w:t>Bar 01: In the LAND | of the LOST | where the WIND | has no NAME,       [Status: BASELINE - 12 Syllables]</w:t>
               <w:br/>
-              <w:t>Bar 02: Every SOUL | in the DARK | is pur-SU | ing a FLAME.</w:t>
+              <w:t>Bar 02: Every SOUL | in the DARK | is pur-SU | ing a FLAME.           [Status: BASELINE - 12 Syllables]</w:t>
               <w:br/>
-              <w:t>Bar 03: There is DUST | on the ROAD | where the TRAV | el-ers TREAD,</w:t>
+              <w:t>Bar 03: There is DUST | on the ROAD | where the TRAV | el-ers TREAD,  [Status: BASELINE - 12 Syllables]</w:t>
               <w:br/>
-              <w:t>Bar 04: And a VOICE | in the NIGHT | that is CALL | ing the DEAD.</w:t>
+              <w:t>Bar 04: And a VOICE | in the NIGHT | that is CALL | ing the DEAD.     [Status: BASELINE - 12 Syllables]</w:t>
               <w:br/>
               <w:br/>
               <w:t>[Act II: Tension - Bars 5–8 (Anacrusis &amp; Syncopation)]</w:t>
               <w:br/>
-              <w:t>Bar 05: The SHAD-ows | LEAP on the WALL | with a SUD | den ATTACK,</w:t>
+              <w:t>Bar 05: The SHAD-ows | LEAP on the WALL | with a SUD | den ATTACK,    [Status: SUBSTITUTION / ANACRUSIS - 11 Syllables]</w:t>
               <w:br/>
-              <w:t>Bar 06: And THEY | keep DRAG | ging the FOOT | steps BACK.</w:t>
+              <w:t>Bar 06: And THEY | keep DRAG | ging the FOOT | steps BACK.             [Status: SYNCOPATION / DISPLACEMENT - 9 Syllables]</w:t>
               <w:br/>
-              <w:t>Bar 07: You can HEAR | the HEA-vy BEAT | on the COLD | STONE FLOOR,</w:t>
+              <w:t>Bar 07: You can HEAR | the HEA-vy BEAT | on the COLD | STONE FLOOR,   [Status: STRESS CLASH / DELIBERATE IRREGULARITY - 11 Syllables]</w:t>
               <w:br/>
-              <w:t>Bar 08: As the CROWD | starts PUSH | ing a-GAINST | the DOOR.</w:t>
+              <w:t>Bar 08: As the CROWD | starts PUSH | ing a-GAINST | the DOOR.         [Status: CATALEXIS / TERMINAL REST - 10 Syllables]</w:t>
               <w:br/>
               <w:br/>
               <w:t>[Act III: Climax - Bars 9–12 (Accumulation Method)]</w:t>
               <w:br/>
-              <w:t>Bar 09: And the RUSH | of the RIV-er in the MID-night HOUR is a STORM that is BREAK-ing the WALLS,</w:t>
+              <w:t>Bar 09: And the RUSH | of the RIV-er in the MID-night HOUR is a STORM that is BREAK-ing the WALLS, [Status: ACCUMULATION - 18 Syllables]</w:t>
               <w:br/>
-              <w:t>Bar 10: With a CRASH | in the THUN-der as the LIGHT-ning STRIKES and the HEA-vy-est TIM-ber FALLS.</w:t>
+              <w:t>Bar 10: With a CRASH | in the THUN-der as the LIGHT-ning STRIKES and the HEA-vy-est TIM-ber FALLS, [Status: ACCUMULATION - 18 Syllables]</w:t>
               <w:br/>
-              <w:t>Bar 11: So we RUN | through the FI-re with the HEAT at our BACK and the SMOKE in our EYES and LUNGS,</w:t>
+              <w:t>Bar 11: So we RUN | through the FI-re with the HEAT at our BACK and the SMOKE in our EYES and LUNGS, [Status: ACCUMULATION - 18 Syllables]</w:t>
               <w:br/>
-              <w:t>Bar 12: Till the SOUND | of the SHOUT-ing in the STREETS re-SOUNDS in a THOU-sand DIF-fer-ent TUNGS.</w:t>
+              <w:t>Bar 12: Till the SOUND | of the SHOUT-ing in the STREETS re-SOUNDS in a THOU-sand DIF-fer-ent TUNGS, [Status: ACCUMULATION - 18 Syllables]</w:t>
               <w:br/>
               <w:br/>
               <w:t>[Act IV: Resolution - Bars 13–16 (Return to Anchor)]</w:t>
               <w:br/>
-              <w:t>Bar 13: Now the MO- | ney lost VAL- | ue and the NOISE | died DOWN,</w:t>
+              <w:t>Bar 13: Now the MO- | ney lost VAL- | ue and the NOISE | died DOWN,   [Status: SUBSTITUTION / ANACRUSIS - 11 Syllables]</w:t>
               <w:br/>
-              <w:t>Bar 14: And a SI- | lent PEACE | came OVER | the TOWN.</w:t>
+              <w:t>Bar 14: And a SI- | lent PEACE | came OVER | the TOWN.                [Status: CATALEXIS / REST - 10 Syllables]</w:t>
               <w:br/>
-              <w:t>Bar 15: For the AN- | chor HOLDS | in the HEART | of the STORM,</w:t>
+              <w:t>Bar 15: For the AN- | chor HOLDS | in the HEART | of the STORM,        [Status: SUBSTITUTION - 11 Syllables]</w:t>
               <w:br/>
-              <w:t>Bar 16: And the BEAT | rolls ON | where the FAITH | is BORN.</w:t>
+              <w:t>Bar 16: And the BEAT | rolls ON | where the FAITH | is BORN.          [Status: RESOLUTION / BASELINE - 10 Syllables]</w:t>
             </w:r>
           </w:p>
         </w:tc>
@@ -1451,7 +1724,7 @@
                 <w:rFonts w:ascii="Georgia" w:hAnsi="Georgia"/>
                 <w:sz w:val="19"/>
               </w:rPr>
-              <w:t>Complete</w:t>
+              <w:t>Audited &amp; Verified</w:t>
             </w:r>
           </w:p>
         </w:tc>
@@ -1525,7 +1798,7 @@
                 <w:rFonts w:ascii="Georgia" w:hAnsi="Georgia"/>
                 <w:sz w:val="19"/>
               </w:rPr>
-              <w:t>Complete</w:t>
+              <w:t>Audited &amp; Verified</w:t>
             </w:r>
           </w:p>
         </w:tc>
@@ -1599,7 +1872,7 @@
                 <w:rFonts w:ascii="Georgia" w:hAnsi="Georgia"/>
                 <w:sz w:val="19"/>
               </w:rPr>
-              <w:t>Complete</w:t>
+              <w:t>Audited &amp; Verified</w:t>
             </w:r>
           </w:p>
         </w:tc>
@@ -1673,7 +1946,7 @@
                 <w:rFonts w:ascii="Georgia" w:hAnsi="Georgia"/>
                 <w:sz w:val="19"/>
               </w:rPr>
-              <w:t>Complete</w:t>
+              <w:t>Audited &amp; Verified</w:t>
             </w:r>
           </w:p>
         </w:tc>
@@ -1747,7 +2020,7 @@
                 <w:rFonts w:ascii="Georgia" w:hAnsi="Georgia"/>
                 <w:sz w:val="19"/>
               </w:rPr>
-              <w:t>Complete</w:t>
+              <w:t>Audited &amp; Verified</w:t>
             </w:r>
           </w:p>
         </w:tc>
@@ -1821,7 +2094,7 @@
                 <w:rFonts w:ascii="Georgia" w:hAnsi="Georgia"/>
                 <w:sz w:val="19"/>
               </w:rPr>
-              <w:t>Complete</w:t>
+              <w:t>Audited &amp; Verified</w:t>
             </w:r>
           </w:p>
         </w:tc>
@@ -1895,7 +2168,7 @@
                 <w:rFonts w:ascii="Georgia" w:hAnsi="Georgia"/>
                 <w:sz w:val="19"/>
               </w:rPr>
-              <w:t>Complete</w:t>
+              <w:t>Audited &amp; Verified</w:t>
             </w:r>
           </w:p>
         </w:tc>
@@ -1969,7 +2242,7 @@
                 <w:rFonts w:ascii="Georgia" w:hAnsi="Georgia"/>
                 <w:sz w:val="19"/>
               </w:rPr>
-              <w:t>Complete</w:t>
+              <w:t>Audited &amp; Verified</w:t>
             </w:r>
           </w:p>
         </w:tc>
@@ -2043,7 +2316,7 @@
                 <w:rFonts w:ascii="Georgia" w:hAnsi="Georgia"/>
                 <w:sz w:val="19"/>
               </w:rPr>
-              <w:t>Complete</w:t>
+              <w:t>Audited &amp; Verified</w:t>
             </w:r>
           </w:p>
         </w:tc>
@@ -2117,7 +2390,7 @@
                 <w:rFonts w:ascii="Georgia" w:hAnsi="Georgia"/>
                 <w:sz w:val="19"/>
               </w:rPr>
-              <w:t>Complete</w:t>
+              <w:t>Audited &amp; Verified</w:t>
             </w:r>
           </w:p>
         </w:tc>
@@ -2161,6 +2434,48 @@
           <w:sz w:val="32"/>
         </w:rPr>
         <w:t>Designing Polyrhythmic Flows</w:t>
+      </w:r>
+    </w:p>
+    <w:p>
+      <w:pPr>
+        <w:spacing w:after="120" w:line="276" w:lineRule="auto"/>
+      </w:pPr>
+      <w:r/>
+      <w:r>
+        <w:rPr>
+          <w:i/>
+        </w:rPr>
+        <w:t>Document Classification: FULL-TEXT SYNOPSIS &amp; CHAPTER MANUSCRIPTS</w:t>
+      </w:r>
+      <w:r>
+        <w:t xml:space="preserve">  </w:t>
+      </w:r>
+    </w:p>
+    <w:p>
+      <w:pPr>
+        <w:spacing w:after="120" w:line="276" w:lineRule="auto"/>
+      </w:pPr>
+      <w:r/>
+      <w:r>
+        <w:rPr>
+          <w:i/>
+        </w:rPr>
+        <w:t>Governing Document: `00-series-bible.md` (v1.0) | Continuity Ledger: `book2-ledger.md`</w:t>
+      </w:r>
+      <w:r/>
+    </w:p>
+    <w:p>
+      <w:pPr>
+        <w:spacing w:before="240" w:after="240"/>
+        <w:jc w:val="center"/>
+      </w:pPr>
+      <w:r>
+        <w:rPr>
+          <w:rFonts w:ascii="Calibri" w:hAnsi="Calibri"/>
+          <w:color w:val="A0A0A0"/>
+          <w:sz w:val="20"/>
+        </w:rPr>
+        <w:t>❖   ❖   ❖</w:t>
       </w:r>
     </w:p>
     <w:p>
@@ -2255,6 +2570,8 @@
                 <w:color w:val="141E32"/>
                 <w:sz w:val="19"/>
               </w:rPr>
+              <w:t>Status: BASELINE (16th Beat-Grid)</w:t>
+              <w:br/>
               <w:t>Subdivision: | 01 | 02 | 03 | 04 | 05 | 06 | 07 | 08 | 09 | 10 | 11 | 12 | 13 | 14 | 15 | 16 |</w:t>
               <w:br/>
               <w:t>Beat:        | 1  |    | e  | a  | 2  |    | e  | a  | 3  |    | e  | a  | 4  |    | e  | a  |</w:t>
@@ -3527,6 +3844,8 @@
                 <w:color w:val="141E32"/>
                 <w:sz w:val="19"/>
               </w:rPr>
+              <w:t>Status: BASELINE (12 Syllables per bar)</w:t>
+              <w:br/>
               <w:t>Bar 01: In the LAND | of the LOST | where the WIND | has no NAME  (12 Syllables)</w:t>
               <w:br/>
               <w:t>Bar 02: Every SOUL | in the DARK | is pur-SU | ing a FLAME    (12 Syllables)</w:t>
@@ -3803,13 +4122,15 @@
                 <w:color w:val="141E32"/>
                 <w:sz w:val="19"/>
               </w:rPr>
-              <w:t>Bar 05: The SHAD-ows | LEAP on the WALL | with a SUD | den ATTACK (11 Syllables)</w:t>
+              <w:t>Status: SYNCOPATION &amp; VARIATION</w:t>
               <w:br/>
-              <w:t>Bar 06: And THEY | keep DRAG | ging the FOOT | steps BACK       (9 Syllables - Heavy Syncopation)</w:t>
+              <w:t>Bar 05: The SHAD-ows | LEAP on the WALL | with a SUD | den ATTACK (11 Syllables - Substitution)</w:t>
               <w:br/>
-              <w:t>Bar 07: You can HEAR | the HEA-vy BEAT | on the COLD | STONE FLOOR (11 Syllables)</w:t>
+              <w:t>Bar 06: And THEY | keep DRAG | ging the FOOT | steps BACK       (9 Syllables - Syncopation)</w:t>
               <w:br/>
-              <w:t>Bar 08: As the CROWD | starts PUSH | ing a-GAINST | the DOOR     (10 Syllables - Terminal Rest)</w:t>
+              <w:t>Bar 07: You can HEAR | the HEA-vy BEAT | on the COLD | STONE FLOOR (11 Syllables - Stress Clash)</w:t>
+              <w:br/>
+              <w:t>Bar 08: As the CROWD | starts PUSH | ing a-GAINST | the DOOR     (10 Syllables - Catalexis)</w:t>
             </w:r>
           </w:p>
         </w:tc>
@@ -4079,6 +4400,8 @@
                 <w:color w:val="141E32"/>
                 <w:sz w:val="19"/>
               </w:rPr>
+              <w:t>Status: ACCUMULATION (Double-Time Density)</w:t>
+              <w:br/>
               <w:t>Bar 09: And the RUSH | of the RIV-er in the MID-night HOUR is a STORM that is BREAK-ing the WALLS (18 Syllables)</w:t>
               <w:br/>
               <w:t>Bar 10: With a CRASH | in the THUN-der as the LIGHT-ning STRIKES and the HEA-vy-est TIM-ber FALLS (18 Syllables)</w:t>
@@ -4355,6 +4678,8 @@
                 <w:color w:val="141E32"/>
                 <w:sz w:val="19"/>
               </w:rPr>
+              <w:t>Status: RESOLUTION &amp; BASELINE</w:t>
+              <w:br/>
               <w:t>Bar 13: Now the MO- | ney lost VAL- | ue and the NOISE | died DOWN (11 Syllables)</w:t>
               <w:br/>
               <w:t>Bar 14: And a SI- | lent PEACE | came OVER | the TOWN           (10 Syllables)</w:t>

</xml_diff>